<commit_message>
Monthly GSTR-1: step through View Summary to Download PDF; GSTR-2B tile by filer type
Co-Authored-By: Claude Opus 5.5 <noreply@anthropic.com>
Claude-Session: https://claude.ai/code/session_01CfUjVh5GATJXjVbnYciLFL
</commit_message>
<xml_diff>
--- a/MiyeeIndia_GST_Return_Downloader_User_Guide.docx
+++ b/MiyeeIndia_GST_Return_Downloader_User_Guide.docx
@@ -1656,6 +1656,26 @@
               </w:rPr>
               <w:t xml:space="preserve">DOWNLOAD FILED (PDF)</w:t>
             </w:r>
+            <w:r>
+              <w:t xml:space="preserve"> (QRMP). Monthly filers: VIEW, then </w:t>
+            </w:r>
+            <w:r>
+              <w:rPr>
+                <w:b/>
+                <w:bCs/>
+              </w:rPr>
+              <w:t xml:space="preserve">VIEW SUMMARY</w:t>
+            </w:r>
+            <w:r>
+              <w:t xml:space="preserve">, then </w:t>
+            </w:r>
+            <w:r>
+              <w:rPr>
+                <w:b/>
+                <w:bCs/>
+              </w:rPr>
+              <w:t xml:space="preserve">DOWNLOAD PDF</w:t>
+            </w:r>
           </w:p>
         </w:tc>
         <w:tc>
@@ -1704,7 +1724,7 @@
           </w:tcPr>
           <w:p>
             <w:r>
-              <w:t xml:space="preserve">VIEW on the GSTR-2B "for the quarter" tile (monthly tile only if there is no quarterly one), then </w:t>
+              <w:t xml:space="preserve">VIEW on the GSTR-2B tile (QRMP: "for the quarter" tile; Monthly: "of the month" tile), then </w:t>
             </w:r>
             <w:r>
               <w:rPr>

</xml_diff>

<commit_message>
Save downloads in one folder per return type, named Return_FY_Month (or Quarter for QRMP)
Co-Authored-By: Claude Opus 5.5 <noreply@anthropic.com>
Claude-Session: https://claude.ai/code/session_01CfUjVh5GATJXjVbnYciLFL
</commit_message>
<xml_diff>
--- a/MiyeeIndia_GST_Return_Downloader_User_Guide.docx
+++ b/MiyeeIndia_GST_Return_Downloader_User_Guide.docx
@@ -1947,7 +1947,7 @@
         <w:spacing w:after="120"/>
       </w:pPr>
       <w:r>
-        <w:t xml:space="preserve">Files are sorted automatically inside your Chrome download folder:</w:t>
+        <w:t xml:space="preserve">Files are sorted automatically into one folder per return type (GSTR-1, GSTR-2B, GSTR-3B) inside your Chrome download folder, named ReturnType_FinancialYear_Month:</w:t>
       </w:r>
     </w:p>
     <w:p>
@@ -1961,7 +1961,7 @@
           <w:sz w:val="20"/>
           <w:szCs w:val="20"/>
         </w:rPr>
-        <w:t xml:space="preserve">Downloads\GST\2025-26\June\GSTR-1_2025-26_June.pdf</w:t>
+        <w:t xml:space="preserve">Downloads\GST\GSTR-1\GSTR-1_2025-26_April.pdf</w:t>
       </w:r>
     </w:p>
     <w:p>
@@ -1969,7 +1969,7 @@
         <w:spacing w:after="120"/>
       </w:pPr>
       <w:r>
-        <w:t xml:space="preserve">If the same file is downloaded twice, Chrome adds a number, for example (1), instead of overwriting.</w:t>
+        <w:t xml:space="preserve">QRMP filers get the quarter instead of the month, for example GSTR-1_2025-26_Q1.pdf. If the same file is downloaded twice, Chrome adds a number, for example (1), instead of overwriting.</w:t>
       </w:r>
     </w:p>
     <w:p>

</xml_diff>

<commit_message>
Add privacy, purpose and disclaimer text; amber-themed Word guide
Co-Authored-By: Claude Opus 5.5 <noreply@anthropic.com>
Claude-Session: https://claude.ai/code/session_01CfUjVh5GATJXjVbnYciLFL
</commit_message>
<xml_diff>
--- a/MiyeeIndia_GST_Return_Downloader_User_Guide.docx
+++ b/MiyeeIndia_GST_Return_Downloader_User_Guide.docx
@@ -11,7 +11,7 @@
         <w:rPr>
           <w:b/>
           <w:bCs/>
-          <w:color w:val="1F3A5F"/>
+          <w:color w:val="7A4A00"/>
           <w:sz w:val="52"/>
           <w:szCs w:val="52"/>
         </w:rPr>
@@ -27,7 +27,7 @@
         <w:rPr>
           <w:b/>
           <w:bCs/>
-          <w:color w:val="E8A317"/>
+          <w:color w:val="F59E0B"/>
           <w:sz w:val="30"/>
           <w:szCs w:val="30"/>
         </w:rPr>
@@ -50,13 +50,29 @@
     </w:p>
     <w:p>
       <w:pPr>
+        <w:spacing w:after="400"/>
+        <w:jc w:val="center"/>
+      </w:pPr>
+      <w:r>
+        <w:rPr>
+          <w:b/>
+          <w:bCs/>
+          <w:color w:val="7A4A00"/>
+          <w:sz w:val="22"/>
+          <w:szCs w:val="22"/>
+        </w:rPr>
+        <w:t xml:space="preserve">Free  •  Open source  •  Runs only in your browser</w:t>
+      </w:r>
+    </w:p>
+    <w:p>
+      <w:pPr>
         <w:spacing w:after="60" w:before="120"/>
         <w:jc w:val="center"/>
       </w:pPr>
       <w:r>
         <w:drawing>
           <wp:inline distT="0" distB="0" distL="0" distR="0">
-            <wp:extent cx="2857500" cy="4419600"/>
+            <wp:extent cx="2857500" cy="4657725"/>
             <wp:effectExtent t="0" r="0" b="0" l="0"/>
             <wp:docPr id="1" name="popup.png" descr="The extension window you will use" title="The extension window you will use"/>
             <wp:cNvGraphicFramePr>
@@ -81,7 +97,7 @@
                   <pic:spPr bwMode="auto">
                     <a:xfrm>
                       <a:off x="0" y="0"/>
-                      <a:ext cx="2857500" cy="4419600"/>
+                      <a:ext cx="2857500" cy="4657725"/>
                     </a:xfrm>
                     <a:prstGeom prst="rect">
                       <a:avLst/>
@@ -120,6 +136,159 @@
         <w:pStyle w:val="Heading1"/>
       </w:pPr>
       <w:r>
+        <w:t xml:space="preserve">About this tool</w:t>
+      </w:r>
+    </w:p>
+    <w:p>
+      <w:pPr>
+        <w:spacing w:after="120"/>
+      </w:pPr>
+      <w:r>
+        <w:t xml:space="preserve">Downloading GST returns one month at a time is slow and tiresome, especially when you need every GSTR-2B for the </w:t>
+      </w:r>
+      <w:r>
+        <w:rPr>
+          <w:b/>
+          <w:bCs/>
+        </w:rPr>
+        <w:t xml:space="preserve">annual ITC reconciliation</w:t>
+      </w:r>
+      <w:r>
+        <w:t xml:space="preserve">. MiyeeIndia GST Return Downloader automates those clicks on the GST portal for GSTR-1, GSTR-2B and GSTR-3B, across several months and financial years in one go.</w:t>
+      </w:r>
+    </w:p>
+    <w:p>
+      <w:pPr>
+        <w:spacing w:after="120"/>
+      </w:pPr>
+      <w:r>
+        <w:t xml:space="preserve">The tool is </w:t>
+      </w:r>
+      <w:r>
+        <w:rPr>
+          <w:b/>
+          <w:bCs/>
+        </w:rPr>
+        <w:t xml:space="preserve">free and open source</w:t>
+      </w:r>
+      <w:r>
+        <w:t xml:space="preserve">. Anyone can read how it works.</w:t>
+      </w:r>
+    </w:p>
+    <w:p>
+      <w:pPr>
+        <w:pStyle w:val="Heading2"/>
+      </w:pPr>
+      <w:r>
+        <w:t xml:space="preserve">Your privacy (designed in line with the DPDP Act, 2023)</w:t>
+      </w:r>
+    </w:p>
+    <w:p>
+      <w:pPr>
+        <w:pStyle w:val="ListParagraph"/>
+        <w:numPr>
+          <w:ilvl w:val="0"/>
+          <w:numId w:val="2"/>
+        </w:numPr>
+        <w:spacing w:after="60"/>
+      </w:pPr>
+      <w:r>
+        <w:t xml:space="preserve">The tool runs </w:t>
+      </w:r>
+      <w:r>
+        <w:rPr>
+          <w:b/>
+          <w:bCs/>
+        </w:rPr>
+        <w:t xml:space="preserve">entirely inside your own browser</w:t>
+      </w:r>
+      <w:r>
+        <w:t xml:space="preserve">.</w:t>
+      </w:r>
+    </w:p>
+    <w:p>
+      <w:pPr>
+        <w:pStyle w:val="ListParagraph"/>
+        <w:numPr>
+          <w:ilvl w:val="0"/>
+          <w:numId w:val="2"/>
+        </w:numPr>
+        <w:spacing w:after="60"/>
+      </w:pPr>
+      <w:r>
+        <w:t xml:space="preserve">You log in to gst.gov.in yourself. Your </w:t>
+      </w:r>
+      <w:r>
+        <w:rPr>
+          <w:b/>
+          <w:bCs/>
+        </w:rPr>
+        <w:t xml:space="preserve">user ID, password and OTP are never seen, stored or shared</w:t>
+      </w:r>
+      <w:r>
+        <w:t xml:space="preserve"> by the tool.</w:t>
+      </w:r>
+    </w:p>
+    <w:p>
+      <w:pPr>
+        <w:pStyle w:val="ListParagraph"/>
+        <w:numPr>
+          <w:ilvl w:val="0"/>
+          <w:numId w:val="2"/>
+        </w:numPr>
+        <w:spacing w:after="60"/>
+      </w:pPr>
+      <w:r>
+        <w:t xml:space="preserve">No personal data is collected, and nothing is sent to any server other than the GST portal you are already using.</w:t>
+      </w:r>
+    </w:p>
+    <w:p>
+      <w:pPr>
+        <w:pStyle w:val="ListParagraph"/>
+        <w:numPr>
+          <w:ilvl w:val="0"/>
+          <w:numId w:val="2"/>
+        </w:numPr>
+        <w:spacing w:after="60"/>
+      </w:pPr>
+      <w:r>
+        <w:t xml:space="preserve">Downloaded returns are saved only on your own computer.</w:t>
+      </w:r>
+    </w:p>
+    <w:p>
+      <w:pPr>
+        <w:pBdr>
+          <w:left w:val="single" w:color="F59E0B" w:sz="24" w:space="8"/>
+        </w:pBdr>
+        <w:shd w:fill="FFF4D6" w:val="clear"/>
+        <w:spacing w:after="200" w:before="80"/>
+      </w:pPr>
+      <w:r>
+        <w:rPr>
+          <w:b/>
+          <w:bCs/>
+        </w:rPr>
+        <w:t xml:space="preserve">Disclaimer:</w:t>
+      </w:r>
+      <w:r>
+        <w:t xml:space="preserve"> this tool was created on </w:t>
+      </w:r>
+      <w:r>
+        <w:rPr>
+          <w:b/>
+          <w:bCs/>
+        </w:rPr>
+        <w:t xml:space="preserve">02.10.2026</w:t>
+      </w:r>
+      <w:r>
+        <w:t xml:space="preserve">. The GST portal may change its layout at any time, which can stop the tool from working properly until it is updated. It is an unofficial tool, not made or approved by GSTN or the Government of India.</w:t>
+      </w:r>
+    </w:p>
+    <w:p>
+      <w:pPr>
+        <w:pStyle w:val="Heading1"/>
+      </w:pPr>
+      <w:r>
         <w:t xml:space="preserve">Before you start</w:t>
       </w:r>
     </w:p>
@@ -193,7 +362,7 @@
     <w:p>
       <w:pPr>
         <w:pBdr>
-          <w:left w:val="single" w:color="E8A317" w:sz="24" w:space="8"/>
+          <w:left w:val="single" w:color="F59E0B" w:sz="24" w:space="8"/>
         </w:pBdr>
         <w:shd w:fill="FFF4D6" w:val="clear"/>
         <w:spacing w:after="200" w:before="80"/>
@@ -445,7 +614,7 @@
     <w:p>
       <w:pPr>
         <w:pBdr>
-          <w:left w:val="single" w:color="E8A317" w:sz="24" w:space="8"/>
+          <w:left w:val="single" w:color="F59E0B" w:sz="24" w:space="8"/>
         </w:pBdr>
         <w:shd w:fill="FFF4D6" w:val="clear"/>
         <w:spacing w:after="200" w:before="80"/>
@@ -839,7 +1008,7 @@
     <w:p>
       <w:pPr>
         <w:pBdr>
-          <w:left w:val="single" w:color="E8A317" w:sz="24" w:space="8"/>
+          <w:left w:val="single" w:color="F59E0B" w:sz="24" w:space="8"/>
         </w:pBdr>
         <w:shd w:fill="FFF4D6" w:val="clear"/>
         <w:spacing w:after="200" w:before="80"/>
@@ -988,7 +1157,7 @@
       <w:r>
         <w:drawing>
           <wp:inline distT="0" distB="0" distL="0" distR="0">
-            <wp:extent cx="2667000" cy="4124325"/>
+            <wp:extent cx="2667000" cy="4343400"/>
             <wp:effectExtent t="0" r="0" b="0" l="0"/>
             <wp:docPr id="1" name="popup.png" descr="The extension window" title="The extension window"/>
             <wp:cNvGraphicFramePr>
@@ -1013,7 +1182,7 @@
                   <pic:spPr bwMode="auto">
                     <a:xfrm>
                       <a:off x="0" y="0"/>
-                      <a:ext cx="2667000" cy="4124325"/>
+                      <a:ext cx="2667000" cy="4343400"/>
                     </a:xfrm>
                     <a:prstGeom prst="rect">
                       <a:avLst/>
@@ -1065,7 +1234,7 @@
         <w:tc>
           <w:tcPr>
             <w:tcW w:type="dxa" w:w="2600"/>
-            <w:shd w:fill="1F3A5F" w:val="clear"/>
+            <w:shd w:fill="F59E0B" w:val="clear"/>
             <w:tcMar>
               <w:top w:type="dxa" w:w="80"/>
               <w:left w:type="dxa" w:w="120"/>
@@ -1078,7 +1247,7 @@
               <w:rPr>
                 <w:b/>
                 <w:bCs/>
-                <w:color w:val="FFFFFF"/>
+                <w:color w:val="3B2600"/>
               </w:rPr>
               <w:t xml:space="preserve">Setting</w:t>
             </w:r>
@@ -1087,7 +1256,7 @@
         <w:tc>
           <w:tcPr>
             <w:tcW w:type="dxa" w:w="6400"/>
-            <w:shd w:fill="1F3A5F" w:val="clear"/>
+            <w:shd w:fill="F59E0B" w:val="clear"/>
             <w:tcMar>
               <w:top w:type="dxa" w:w="80"/>
               <w:left w:type="dxa" w:w="120"/>
@@ -1100,7 +1269,7 @@
               <w:rPr>
                 <w:b/>
                 <w:bCs/>
-                <w:color w:val="FFFFFF"/>
+                <w:color w:val="3B2600"/>
               </w:rPr>
               <w:t xml:space="preserve">What to choose</w:t>
             </w:r>
@@ -1554,7 +1723,7 @@
         <w:tc>
           <w:tcPr>
             <w:tcW w:type="dxa" w:w="1500"/>
-            <w:shd w:fill="1F3A5F" w:val="clear"/>
+            <w:shd w:fill="F59E0B" w:val="clear"/>
             <w:tcMar>
               <w:top w:type="dxa" w:w="80"/>
               <w:left w:type="dxa" w:w="120"/>
@@ -1567,7 +1736,7 @@
               <w:rPr>
                 <w:b/>
                 <w:bCs/>
-                <w:color w:val="FFFFFF"/>
+                <w:color w:val="3B2600"/>
               </w:rPr>
               <w:t xml:space="preserve">Return</w:t>
             </w:r>
@@ -1576,7 +1745,7 @@
         <w:tc>
           <w:tcPr>
             <w:tcW w:type="dxa" w:w="5700"/>
-            <w:shd w:fill="1F3A5F" w:val="clear"/>
+            <w:shd w:fill="F59E0B" w:val="clear"/>
             <w:tcMar>
               <w:top w:type="dxa" w:w="80"/>
               <w:left w:type="dxa" w:w="120"/>
@@ -1589,7 +1758,7 @@
               <w:rPr>
                 <w:b/>
                 <w:bCs/>
-                <w:color w:val="FFFFFF"/>
+                <w:color w:val="3B2600"/>
               </w:rPr>
               <w:t xml:space="preserve">What the tool clicks</w:t>
             </w:r>
@@ -1598,7 +1767,7 @@
         <w:tc>
           <w:tcPr>
             <w:tcW w:type="dxa" w:w="1800"/>
-            <w:shd w:fill="1F3A5F" w:val="clear"/>
+            <w:shd w:fill="F59E0B" w:val="clear"/>
             <w:tcMar>
               <w:top w:type="dxa" w:w="80"/>
               <w:left w:type="dxa" w:w="120"/>
@@ -1611,7 +1780,7 @@
               <w:rPr>
                 <w:b/>
                 <w:bCs/>
-                <w:color w:val="FFFFFF"/>
+                <w:color w:val="3B2600"/>
               </w:rPr>
               <w:t xml:space="preserve">File you get</w:t>
             </w:r>
@@ -1952,7 +2121,7 @@
     </w:p>
     <w:p>
       <w:pPr>
-        <w:shd w:fill="EEF2F7" w:val="clear"/>
+        <w:shd w:fill="FFF8E7" w:val="clear"/>
         <w:spacing w:after="200"/>
       </w:pPr>
       <w:r>
@@ -2093,7 +2262,7 @@
         <w:tc>
           <w:tcPr>
             <w:tcW w:type="dxa" w:w="3400"/>
-            <w:shd w:fill="1F3A5F" w:val="clear"/>
+            <w:shd w:fill="F59E0B" w:val="clear"/>
             <w:tcMar>
               <w:top w:type="dxa" w:w="80"/>
               <w:left w:type="dxa" w:w="120"/>
@@ -2106,7 +2275,7 @@
               <w:rPr>
                 <w:b/>
                 <w:bCs/>
-                <w:color w:val="FFFFFF"/>
+                <w:color w:val="3B2600"/>
               </w:rPr>
               <w:t xml:space="preserve">Message or problem</w:t>
             </w:r>
@@ -2115,7 +2284,7 @@
         <w:tc>
           <w:tcPr>
             <w:tcW w:type="dxa" w:w="5600"/>
-            <w:shd w:fill="1F3A5F" w:val="clear"/>
+            <w:shd w:fill="F59E0B" w:val="clear"/>
             <w:tcMar>
               <w:top w:type="dxa" w:w="80"/>
               <w:left w:type="dxa" w:w="120"/>
@@ -2128,7 +2297,7 @@
               <w:rPr>
                 <w:b/>
                 <w:bCs/>
-                <w:color w:val="FFFFFF"/>
+                <w:color w:val="3B2600"/>
               </w:rPr>
               <w:t xml:space="preserve">What to do</w:t>
             </w:r>
@@ -2389,7 +2558,7 @@
         <w:pStyle w:val="Heading1"/>
       </w:pPr>
       <w:r>
-        <w:t xml:space="preserve">Important</w:t>
+        <w:t xml:space="preserve">Important reminders</w:t>
       </w:r>
     </w:p>
     <w:p>
@@ -2960,7 +3129,7 @@
     <w:qFormat/>
     <w:pPr>
       <w:pBdr>
-        <w:bottom w:val="single" w:color="E8A317" w:sz="8" w:space="4"/>
+        <w:bottom w:val="single" w:color="F59E0B" w:sz="8" w:space="4"/>
       </w:pBdr>
       <w:spacing w:after="160" w:before="360"/>
       <w:outlineLvl w:val="0"/>
@@ -2968,7 +3137,7 @@
     <w:rPr>
       <w:b/>
       <w:bCs/>
-      <w:color w:val="1F3A5F"/>
+      <w:color w:val="7A4A00"/>
       <w:sz w:val="32"/>
       <w:szCs w:val="32"/>
     </w:rPr>
@@ -2985,7 +3154,7 @@
     <w:rPr>
       <w:b/>
       <w:bCs/>
-      <w:color w:val="1F3A5F"/>
+      <w:color w:val="7A4A00"/>
       <w:sz w:val="26"/>
       <w:szCs w:val="26"/>
     </w:rPr>

</xml_diff>

<commit_message>
Web Store hardening: event-driven waits, least-privilege manifest, privacy policy
- Replace fixed step delays with settle() (MutationObserver quiet window +
  overlay check), selectWhenReady() for async-filled dropdowns, and a real
  download-started signal recorded by the service worker.
- Drop activeTab and scripting permissions; host access is https://*.gst.gov.in/* only.
- Service worker documented as stateless; job state lives in chrome.storage.local.
- Add PRIVACY.md and package.sh; README and Word guide updated.

Co-Authored-By: Claude Opus 5.5 <noreply@anthropic.com>
Claude-Session: https://claude.ai/code/session_01CfUjVh5GATJXjVbnYciLFL
</commit_message>
<xml_diff>
--- a/MiyeeIndia_GST_Return_Downloader_User_Guide.docx
+++ b/MiyeeIndia_GST_Return_Downloader_User_Guide.docx
@@ -1499,7 +1499,7 @@
           </w:tcPr>
           <w:p>
             <w:r>
-              <w:t xml:space="preserve">Step delay (ms)</w:t>
+              <w:t xml:space="preserve">Pause between periods (ms)</w:t>
             </w:r>
           </w:p>
         </w:tc>
@@ -1522,10 +1522,10 @@
                 <w:b/>
                 <w:bCs/>
               </w:rPr>
-              <w:t xml:space="preserve">4000</w:t>
-            </w:r>
-            <w:r>
-              <w:t xml:space="preserve">. If the portal is slow and you see "timed out", raise it to 6000 to 8000.</w:t>
+              <w:t xml:space="preserve">2000</w:t>
+            </w:r>
+            <w:r>
+              <w:t xml:space="preserve">. Each step already waits for the portal, so this is only a short breather between periods.</w:t>
             </w:r>
           </w:p>
         </w:tc>
@@ -2377,7 +2377,7 @@
           </w:tcPr>
           <w:p>
             <w:r>
-              <w:t xml:space="preserve">The portal was slow. Raise Step delay to 6000 to 8000 and start again for the missed periods.</w:t>
+              <w:t xml:space="preserve">The portal was very slow or its layout changed. Start again for the missed periods; if it repeats, report it on GitHub.</w:t>
             </w:r>
           </w:p>
         </w:tc>
@@ -2531,7 +2531,7 @@
           </w:tcPr>
           <w:p>
             <w:r>
-              <w:t xml:space="preserve">Nothing happens after an update</w:t>
+              <w:t xml:space="preserve">"The GST tab needs a refresh"</w:t>
             </w:r>
           </w:p>
         </w:tc>
@@ -2547,7 +2547,17 @@
           </w:tcPr>
           <w:p>
             <w:r>
-              <w:t xml:space="preserve">Reload the extension in chrome://extensions, then press F5 on the GST tab.</w:t>
+              <w:t xml:space="preserve">Press </w:t>
+            </w:r>
+            <w:r>
+              <w:rPr>
+                <w:b/>
+                <w:bCs/>
+              </w:rPr>
+              <w:t xml:space="preserve">F5</w:t>
+            </w:r>
+            <w:r>
+              <w:t xml:space="preserve"> on the GST tab once, then click Start again. Normal right after installing or updating.</w:t>
             </w:r>
           </w:p>
         </w:tc>

</xml_diff>